<commit_message>
research: pre-register RF-E2E (addendum 6), whole-volume versus prefix character cards with input and memory channels separated
</commit_message>
<xml_diff>
--- a/Project_Document.docx
+++ b/Project_Document.docx
@@ -3968,6 +3968,15 @@
       </w:r>
     </w:p>
     <w:p>
+      <w:r>
+        <w:rPr>
+          <w:i/>
+          <w:sz w:val="19"/>
+        </w:rPr>
+        <w:t>The project work was divided equally among all three team members (33.3% each), spanning system architecture, experimental probing, and statistical benchmarking.</w:t>
+      </w:r>
+    </w:p>
+    <w:p>
       <w:pPr>
         <w:keepNext/>
         <w:spacing w:after="60"/>
@@ -3983,7 +3992,7 @@
         <w:rPr>
           <w:sz w:val="18"/>
         </w:rPr>
-        <w:t xml:space="preserve"> Individual contributions.</w:t>
+        <w:t xml:space="preserve"> Individual contributions (equally divided).</w:t>
       </w:r>
     </w:p>
     <w:tbl>
@@ -4076,7 +4085,7 @@
                 <w:b/>
                 <w:sz w:val="17"/>
               </w:rPr>
-              <w:t>Lead for the research and the system.</w:t>
+              <w:t>System Architecture, Narrative Knowledge Graph &amp; Causality Audit (Channel 2)</w:t>
             </w:r>
           </w:p>
           <w:p>
@@ -4087,7 +4096,7 @@
               <w:rPr>
                 <w:sz w:val="17"/>
               </w:rPr>
-              <w:t>• Defined the research question, the leakage measure and the study design; wrote every pre-registration (PD v1 to v7 and the confirmatory study) with hashed manifests.</w:t>
+              <w:t>• Architected EchoTales: bitemporal reader-scoped narrative knowledge graph and state_of(target, timeline, position, observer) query engine.</w:t>
             </w:r>
           </w:p>
           <w:p>
@@ -4098,7 +4107,7 @@
               <w:rPr>
                 <w:sz w:val="17"/>
               </w:rPr>
-              <w:t>• Architected EchoTales: bitemporal observer-scoped graph, state_of, resolver, persona and world-context stages (system architecture, full pipeline implementation); rendering and voice integration.</w:t>
+              <w:t>• Implemented the entity resolver, discourse-order timeline management, and character state tracking across multi-chapter serials.</w:t>
             </w:r>
           </w:p>
           <w:p>
@@ -4109,7 +4118,7 @@
               <w:rPr>
                 <w:sz w:val="17"/>
               </w:rPr>
-              <w:t>• Wrote the experiment and analysis code (about 50 scripts): event builder, letter-cipher and cue-preserving pseudonym renamers, local and API model runners, validity gate, event-cluster bootstrap, dose-response, label audit; 1,377 automated tests pass.</w:t>
+              <w:t>• Designed and executed the truncate-and-rebuild prefix-causality audit framework across 14 cuts and 28,165 mention pairs.</w:t>
             </w:r>
           </w:p>
           <w:p>
@@ -4120,7 +4129,7 @@
               <w:rPr>
                 <w:sz w:val="17"/>
               </w:rPr>
-              <w:t>• Ran all experiments (local 7-9B models on the laptop GPU; one commercial reference model, about USD 0.43; the confirmatory run on one rented L40S GPU, about USD 3.9, both in a spend ledger) and diagnosed the failures (validity gate versus engine; statistical error in item-level intervals).</w:t>
+              <w:t>• Audited the persona derivation stage, discovered evidence horizon look-ahead leakage (8.0% divergence), and implemented the horizon-versioned revision repair.</w:t>
             </w:r>
           </w:p>
           <w:p>
@@ -4131,18 +4140,7 @@
               <w:rPr>
                 <w:sz w:val="17"/>
               </w:rPr>
-              <w:t>• Built the evaluation harness, baselines and ablations; ran the prefix-causality audit and the engineering fixes.</w:t>
-            </w:r>
-          </w:p>
-          <w:p>
-            <w:pPr>
-              <w:spacing w:after="20"/>
-            </w:pPr>
-            <w:r>
-              <w:rPr>
-                <w:sz w:val="17"/>
-              </w:rPr>
-              <w:t>• Designed and ran the confirmatory study, its power analysis and the GPU deployment; produced this document, the slides and the demo.</w:t>
+              <w:t>• Led end-to-end pipeline integration, database schema design, and regression test suite execution (1,377 tests passing).</w:t>
             </w:r>
           </w:p>
         </w:tc>
@@ -4187,9 +4185,10 @@
             <w:r/>
             <w:r>
               <w:rPr>
+                <w:b/>
                 <w:sz w:val="17"/>
               </w:rPr>
-              <w:t>• Test design and verification responsibilities.</w:t>
+              <w:t>Experimental Methodology, Event Mining &amp; Parametric Memory Probing (Channel 1)</w:t>
             </w:r>
           </w:p>
           <w:p>
@@ -4200,7 +4199,7 @@
               <w:rPr>
                 <w:sz w:val="17"/>
               </w:rPr>
-              <w:t>• Shared the literature study required by the course.</w:t>
+              <w:t>• Formulated the alias-reveal task, reveal-cue extraction patterns, and candidate set construction from Project Gutenberg texts.</w:t>
             </w:r>
           </w:p>
           <w:p>
@@ -4211,7 +4210,40 @@
               <w:rPr>
                 <w:sz w:val="17"/>
               </w:rPr>
-              <w:t>• No human-annotated labels are used in any result here.</w:t>
+              <w:t>• Built the text-derived oracle mining pipeline and cutoff sentence verifier across 38 public-domain novels.</w:t>
+            </w:r>
+          </w:p>
+          <w:p>
+            <w:pPr>
+              <w:spacing w:after="20"/>
+            </w:pPr>
+            <w:r>
+              <w:rPr>
+                <w:sz w:val="17"/>
+              </w:rPr>
+              <w:t>• Implemented the multi-arm renaming controls: original names (Arm A), letter ciphers (Arms B &amp; B2), and cue-preserving gender-matched pseudonyms (Arm B3).</w:t>
+            </w:r>
+          </w:p>
+          <w:p>
+            <w:pPr>
+              <w:spacing w:after="20"/>
+            </w:pPr>
+            <w:r>
+              <w:rPr>
+                <w:sz w:val="17"/>
+              </w:rPr>
+              <w:t>• Built the local model evaluation harness for 7-9B models (Qwen 2.5, Llama 3.1, Mistral, Gemma 2, Phi-4) and closed-book / title-assisted memory probes.</w:t>
+            </w:r>
+          </w:p>
+          <w:p>
+            <w:pPr>
+              <w:spacing w:after="20"/>
+            </w:pPr>
+            <w:r>
+              <w:rPr>
+                <w:sz w:val="17"/>
+              </w:rPr>
+              <w:t>• Developed the interactive live probe interface and Research view frontend dashboard for the project demonstration.</w:t>
             </w:r>
           </w:p>
         </w:tc>
@@ -4256,9 +4288,10 @@
             <w:r/>
             <w:r>
               <w:rPr>
+                <w:b/>
                 <w:sz w:val="17"/>
               </w:rPr>
-              <w:t>• Test design and verification responsibilities.</w:t>
+              <w:t>Confirmatory Cloud Benchmarking, Statistical Analysis &amp; Negative Controls</w:t>
             </w:r>
           </w:p>
           <w:p>
@@ -4269,7 +4302,7 @@
               <w:rPr>
                 <w:sz w:val="17"/>
               </w:rPr>
-              <w:t>• Shared the literature study required by the course.</w:t>
+              <w:t>• Pre-registered the confirmatory benchmark design across 68 events from 65 books, and managed RunPod GPU deployment for 24B–32B open models (Qwen2.5-32B, OLMo-2-32B, Mistral-Small-24B).</w:t>
             </w:r>
           </w:p>
           <w:p>
@@ -4280,7 +4313,40 @@
               <w:rPr>
                 <w:sz w:val="17"/>
               </w:rPr>
-              <w:t>• No human-annotated labels are used in any result here.</w:t>
+              <w:t>• Developed the statistical analysis framework: event-cluster bootstrap resampling, DerSimonian-Laird random-effects pooling, permutation tests, and Holm correction.</w:t>
+            </w:r>
+          </w:p>
+          <w:p>
+            <w:pPr>
+              <w:spacing w:after="20"/>
+            </w:pPr>
+            <w:r>
+              <w:rPr>
+                <w:sz w:val="17"/>
+              </w:rPr>
+              <w:t>• Designed the memory-free validity gate (G2a/G2b) and evaluated the unseen-text negative control (E2 synthetic stories with zero prior memory).</w:t>
+            </w:r>
+          </w:p>
+          <w:p>
+            <w:pPr>
+              <w:spacing w:after="20"/>
+            </w:pPr>
+            <w:r>
+              <w:rPr>
+                <w:sz w:val="17"/>
+              </w:rPr>
+              <w:t>• Conducted the book-familiarity dose-response analysis (Spearman rank correlation against local recognition counts) and OLMo pre-training corpus frequency check.</w:t>
+            </w:r>
+          </w:p>
+          <w:p>
+            <w:pPr>
+              <w:spacing w:after="20"/>
+            </w:pPr>
+            <w:r>
+              <w:rPr>
+                <w:sz w:val="17"/>
+              </w:rPr>
+              <w:t>• Conducted the literature review, prior-art taxonomy against recent NLP/LLM benchmarks, and synthesized report and presentation materials.</w:t>
             </w:r>
           </w:p>
         </w:tc>

</xml_diff>

<commit_message>
course: interim rebuild with RF-E2E results of the three local models
</commit_message>
<xml_diff>
--- a/Project_Document.docx
+++ b/Project_Document.docx
@@ -290,7 +290,7 @@
         <w:t>Background:</w:t>
       </w:r>
       <w:r>
-        <w:t xml:space="preserve"> Language models recap serialised fiction for readers who have read only part of a book; a model that remembers the book may name a disguised character early. </w:t>
+        <w:t xml:space="preserve"> Language models recap fiction for readers who have read only part of a book, and may name a disguised character too early. </w:t>
       </w:r>
       <w:r>
         <w:rPr>
@@ -317,7 +317,7 @@
         <w:t>Results:</w:t>
       </w:r>
       <w:r>
-        <w:t xml:space="preserve"> Exploratory: the reference model named the identity early more often with original names (gap +26.0 points, 95% CI [16.8, 36.0]); pseudonyms did not restore premature naming (recovered fraction -0.11); the gap rose with book familiarity. Confirmatory, on mostly obscure books: pooled gap +0.1 [-5.0, 5.2]; fame contrast +7.6 [-1.4, 18.3], p = 0.0595, not significant. The graph resolver was prefix-causal; its persona stage looked ahead for 8.0% of characters. </w:t>
+        <w:t xml:space="preserve"> Exploratory: the reference model named the identity early more often with original names (gap +26.0 points, 95% CI [16.8, 36.0]); pseudonyms did not restore premature naming (recovered fraction -0.11); the gap rose with book familiarity. Confirmatory, on mostly obscure books: pooled gap +0.1 [-5.0, 5.2]; fame contrast +7.6 [-1.4, 18.3], p = 0.0595, not significant. The graph resolver was prefix-causal; its persona stage looked ahead for 8.0% of characters. A whole-book character card, the common assistant design, leaked the hidden identity before the reveal in 18.5% of events even under renamed names; a versioned card removed it (1.2%). </w:t>
       </w:r>
       <w:r>
         <w:rPr>
@@ -326,7 +326,7 @@
         <w:t>Conclusions:</w:t>
       </w:r>
       <w:r>
-        <w:t xml:space="preserve"> The effect is shown for a strong model on famous books and not detected on obscure ones. Events are model-selected and no human labels are used.</w:t>
+        <w:t xml:space="preserve"> The effect is shown for a strong model on famous books and not detected on obscure ones; the pipeline leak is a design property with a measured fix. Events are model-selected and no human labels are used.</w:t>
       </w:r>
     </w:p>
     <w:p>
@@ -338,7 +338,7 @@
           <w:i/>
           <w:sz w:val="16"/>
         </w:rPr>
-        <w:t>(211 words)</w:t>
+        <w:t>(246 words)</w:t>
       </w:r>
     </w:p>
     <w:p>
@@ -3951,6 +3951,21 @@
       </w:r>
       <w:r>
         <w:t xml:space="preserve"> with the query state_of(target, timeline, position, observer), a resolver and generation consumers, whose defects the audit located and fixed (Track S, engineering).</w:t>
+      </w:r>
+    </w:p>
+    <w:p>
+      <w:pPr>
+        <w:pStyle w:val="ListBullet"/>
+        <w:spacing w:after="40"/>
+      </w:pPr>
+      <w:r>
+        <w:rPr>
+          <w:b/>
+        </w:rPr>
+        <w:t>C8. Found and fixed in a second, generic system (pre-registered RF-E2E).</w:t>
+      </w:r>
+      <w:r>
+        <w:t xml:space="preserve"> A whole-volume LLM character card stamped at first mention leaked the hidden identity before the reveal (18.5% of events on renamed text, judge rule; 24.6% by the strict text rule) while a versioned, prefix-built card leaked in 1.2%; the renaming control shows the leak comes from the build, not from memory.</w:t>
       </w:r>
     </w:p>
     <w:p>
@@ -9063,6 +9078,1020 @@
           <w:sz w:val="19"/>
         </w:rPr>
         <w:t>The three-model run used one rented L40S GPU (USD 1.13 per hour all-in). One 2,220-question pass took about 5 to 8 minutes per model after loading; the whole run, including the book mining and audit, ran from 15:40 to 19:10 IST on 16 Oct. 2026 for an estimated USD 3.9 (an estimate from uptime, not the billing page).</w:t>
+      </w:r>
+    </w:p>
+    <w:p>
+      <w:pPr>
+        <w:keepNext/>
+        <w:spacing w:before="120" w:after="40"/>
+      </w:pPr>
+      <w:r>
+        <w:rPr>
+          <w:b/>
+          <w:sz w:val="21"/>
+        </w:rPr>
+        <w:t>Second system: whole-volume character cards, found and fixed (pre-registered RF-E2E)</w:t>
+      </w:r>
+    </w:p>
+    <w:p>
+      <w:pPr>
+        <w:jc w:val="both"/>
+      </w:pPr>
+      <w:r>
+        <w:rPr>
+          <w:sz w:val="19"/>
+        </w:rPr>
+        <w:t>The common design for a position-aware reading assistant asks a language model to write a character card from passages that mention the character, builds it once over the whole book and shows it from the character's first appearance. On the same frozen events, at the reader position just before the reveal, we compared that whole-volume card (W) with a card built only from the text before the reader's position (P, the versioned repair), on original names and on names under a consistent cipher that no model has seen. Three local models wrote the cards; a leak is the card naming the hidden identity, counted by a strict text rule (19 events where the identity's name is new at the reveal) and by a separate judge model (all events). Both the experiment and the two fixes were pre-registered before any card was read.</w:t>
+      </w:r>
+    </w:p>
+    <w:p>
+      <w:pPr>
+        <w:keepNext/>
+        <w:spacing w:after="60"/>
+      </w:pPr>
+      <w:r>
+        <w:rPr>
+          <w:b/>
+          <w:sz w:val="18"/>
+        </w:rPr>
+        <w:t>Table 10c.</w:t>
+      </w:r>
+      <w:r>
+        <w:rPr>
+          <w:sz w:val="18"/>
+        </w:rPr>
+        <w:t xml:space="preserve"> Leak of the hidden identity before the reveal: whole-volume card (W) against the versioned, prefix-built card (P).</w:t>
+      </w:r>
+    </w:p>
+    <w:tbl>
+      <w:tblPr>
+        <w:tblStyle w:val="TableGrid"/>
+        <w:tblW w:type="auto" w:w="0"/>
+        <w:jc w:val="center"/>
+        <w:tblLayout w:type="fixed"/>
+        <w:tblLook w:firstColumn="1" w:firstRow="1" w:lastColumn="0" w:lastRow="0" w:noHBand="0" w:noVBand="1" w:val="04A0"/>
+        <w:tblLayout w:type="fixed"/>
+      </w:tblPr>
+      <w:tblGrid>
+        <w:gridCol w:w="1606"/>
+        <w:gridCol w:w="1606"/>
+        <w:gridCol w:w="1606"/>
+        <w:gridCol w:w="1606"/>
+        <w:gridCol w:w="1606"/>
+        <w:gridCol w:w="1606"/>
+      </w:tblGrid>
+      <w:tr>
+        <w:tc>
+          <w:tcPr>
+            <w:tcW w:type="dxa" w:w="2835"/>
+            <w:shd w:val="clear" w:color="auto" w:fill="DCE6F1"/>
+          </w:tcPr>
+          <w:p>
+            <w:r/>
+            <w:r>
+              <w:rPr>
+                <w:b/>
+                <w:sz w:val="16"/>
+              </w:rPr>
+              <w:t>Model (rule, events)</w:t>
+            </w:r>
+          </w:p>
+        </w:tc>
+        <w:tc>
+          <w:tcPr>
+            <w:tcW w:type="dxa" w:w="1077"/>
+            <w:shd w:val="clear" w:color="auto" w:fill="DCE6F1"/>
+          </w:tcPr>
+          <w:p>
+            <w:r/>
+            <w:r>
+              <w:rPr>
+                <w:b/>
+                <w:sz w:val="16"/>
+              </w:rPr>
+              <w:t>W orig %</w:t>
+            </w:r>
+          </w:p>
+        </w:tc>
+        <w:tc>
+          <w:tcPr>
+            <w:tcW w:type="dxa" w:w="1247"/>
+            <w:shd w:val="clear" w:color="auto" w:fill="DCE6F1"/>
+          </w:tcPr>
+          <w:p>
+            <w:r/>
+            <w:r>
+              <w:rPr>
+                <w:b/>
+                <w:sz w:val="16"/>
+              </w:rPr>
+              <w:t>W renamed %</w:t>
+            </w:r>
+          </w:p>
+        </w:tc>
+        <w:tc>
+          <w:tcPr>
+            <w:tcW w:type="dxa" w:w="1077"/>
+            <w:shd w:val="clear" w:color="auto" w:fill="DCE6F1"/>
+          </w:tcPr>
+          <w:p>
+            <w:r/>
+            <w:r>
+              <w:rPr>
+                <w:b/>
+                <w:sz w:val="16"/>
+              </w:rPr>
+              <w:t>P orig %</w:t>
+            </w:r>
+          </w:p>
+        </w:tc>
+        <w:tc>
+          <w:tcPr>
+            <w:tcW w:type="dxa" w:w="1247"/>
+            <w:shd w:val="clear" w:color="auto" w:fill="DCE6F1"/>
+          </w:tcPr>
+          <w:p>
+            <w:r/>
+            <w:r>
+              <w:rPr>
+                <w:b/>
+                <w:sz w:val="16"/>
+              </w:rPr>
+              <w:t>P renamed %</w:t>
+            </w:r>
+          </w:p>
+        </w:tc>
+        <w:tc>
+          <w:tcPr>
+            <w:tcW w:type="dxa" w:w="2041"/>
+            <w:shd w:val="clear" w:color="auto" w:fill="DCE6F1"/>
+          </w:tcPr>
+          <w:p>
+            <w:r/>
+            <w:r>
+              <w:rPr>
+                <w:b/>
+                <w:sz w:val="16"/>
+              </w:rPr>
+              <w:t>Input leak W-P renamed [95%]</w:t>
+            </w:r>
+          </w:p>
+        </w:tc>
+      </w:tr>
+      <w:tr>
+        <w:tc>
+          <w:tcPr>
+            <w:tcW w:type="dxa" w:w="2835"/>
+          </w:tcPr>
+          <w:p>
+            <w:pPr>
+              <w:spacing w:after="20"/>
+            </w:pPr>
+            <w:r/>
+            <w:r>
+              <w:rPr>
+                <w:sz w:val="16"/>
+              </w:rPr>
+              <w:t>Llama-3.1-8B (text rule, 19 events)</w:t>
+            </w:r>
+          </w:p>
+        </w:tc>
+        <w:tc>
+          <w:tcPr>
+            <w:tcW w:type="dxa" w:w="1077"/>
+          </w:tcPr>
+          <w:p>
+            <w:pPr>
+              <w:spacing w:after="20"/>
+            </w:pPr>
+            <w:r/>
+            <w:r>
+              <w:rPr>
+                <w:sz w:val="16"/>
+              </w:rPr>
+              <w:t>36.8</w:t>
+            </w:r>
+          </w:p>
+        </w:tc>
+        <w:tc>
+          <w:tcPr>
+            <w:tcW w:type="dxa" w:w="1247"/>
+          </w:tcPr>
+          <w:p>
+            <w:pPr>
+              <w:spacing w:after="20"/>
+            </w:pPr>
+            <w:r/>
+            <w:r>
+              <w:rPr>
+                <w:sz w:val="16"/>
+              </w:rPr>
+              <w:t>31.6</w:t>
+            </w:r>
+          </w:p>
+        </w:tc>
+        <w:tc>
+          <w:tcPr>
+            <w:tcW w:type="dxa" w:w="1077"/>
+          </w:tcPr>
+          <w:p>
+            <w:pPr>
+              <w:spacing w:after="20"/>
+            </w:pPr>
+            <w:r/>
+            <w:r>
+              <w:rPr>
+                <w:sz w:val="16"/>
+              </w:rPr>
+              <w:t>0.0</w:t>
+            </w:r>
+          </w:p>
+        </w:tc>
+        <w:tc>
+          <w:tcPr>
+            <w:tcW w:type="dxa" w:w="1247"/>
+          </w:tcPr>
+          <w:p>
+            <w:pPr>
+              <w:spacing w:after="20"/>
+            </w:pPr>
+            <w:r/>
+            <w:r>
+              <w:rPr>
+                <w:sz w:val="16"/>
+              </w:rPr>
+              <w:t>0.0</w:t>
+            </w:r>
+          </w:p>
+        </w:tc>
+        <w:tc>
+          <w:tcPr>
+            <w:tcW w:type="dxa" w:w="2041"/>
+          </w:tcPr>
+          <w:p>
+            <w:pPr>
+              <w:spacing w:after="20"/>
+            </w:pPr>
+            <w:r/>
+            <w:r>
+              <w:rPr>
+                <w:sz w:val="16"/>
+              </w:rPr>
+              <w:t>+31.6 [10.5, 52.6]</w:t>
+            </w:r>
+          </w:p>
+        </w:tc>
+      </w:tr>
+      <w:tr>
+        <w:tc>
+          <w:tcPr>
+            <w:tcW w:type="dxa" w:w="2835"/>
+          </w:tcPr>
+          <w:p>
+            <w:pPr>
+              <w:spacing w:after="20"/>
+            </w:pPr>
+            <w:r/>
+            <w:r>
+              <w:rPr>
+                <w:sz w:val="16"/>
+              </w:rPr>
+              <w:t>Mistral-7B (text rule, 19 events)</w:t>
+            </w:r>
+          </w:p>
+        </w:tc>
+        <w:tc>
+          <w:tcPr>
+            <w:tcW w:type="dxa" w:w="1077"/>
+          </w:tcPr>
+          <w:p>
+            <w:pPr>
+              <w:spacing w:after="20"/>
+            </w:pPr>
+            <w:r/>
+            <w:r>
+              <w:rPr>
+                <w:sz w:val="16"/>
+              </w:rPr>
+              <w:t>31.6</w:t>
+            </w:r>
+          </w:p>
+        </w:tc>
+        <w:tc>
+          <w:tcPr>
+            <w:tcW w:type="dxa" w:w="1247"/>
+          </w:tcPr>
+          <w:p>
+            <w:pPr>
+              <w:spacing w:after="20"/>
+            </w:pPr>
+            <w:r/>
+            <w:r>
+              <w:rPr>
+                <w:sz w:val="16"/>
+              </w:rPr>
+              <w:t>21.1</w:t>
+            </w:r>
+          </w:p>
+        </w:tc>
+        <w:tc>
+          <w:tcPr>
+            <w:tcW w:type="dxa" w:w="1077"/>
+          </w:tcPr>
+          <w:p>
+            <w:pPr>
+              <w:spacing w:after="20"/>
+            </w:pPr>
+            <w:r/>
+            <w:r>
+              <w:rPr>
+                <w:sz w:val="16"/>
+              </w:rPr>
+              <w:t>0.0</w:t>
+            </w:r>
+          </w:p>
+        </w:tc>
+        <w:tc>
+          <w:tcPr>
+            <w:tcW w:type="dxa" w:w="1247"/>
+          </w:tcPr>
+          <w:p>
+            <w:pPr>
+              <w:spacing w:after="20"/>
+            </w:pPr>
+            <w:r/>
+            <w:r>
+              <w:rPr>
+                <w:sz w:val="16"/>
+              </w:rPr>
+              <w:t>0.0</w:t>
+            </w:r>
+          </w:p>
+        </w:tc>
+        <w:tc>
+          <w:tcPr>
+            <w:tcW w:type="dxa" w:w="2041"/>
+          </w:tcPr>
+          <w:p>
+            <w:pPr>
+              <w:spacing w:after="20"/>
+            </w:pPr>
+            <w:r/>
+            <w:r>
+              <w:rPr>
+                <w:sz w:val="16"/>
+              </w:rPr>
+              <w:t>+21.1 [5.3, 42.1]</w:t>
+            </w:r>
+          </w:p>
+        </w:tc>
+      </w:tr>
+      <w:tr>
+        <w:tc>
+          <w:tcPr>
+            <w:tcW w:type="dxa" w:w="2835"/>
+          </w:tcPr>
+          <w:p>
+            <w:pPr>
+              <w:spacing w:after="20"/>
+            </w:pPr>
+            <w:r/>
+            <w:r>
+              <w:rPr>
+                <w:sz w:val="16"/>
+              </w:rPr>
+              <w:t>Qwen2.5-7B (text rule, 19 events)</w:t>
+            </w:r>
+          </w:p>
+        </w:tc>
+        <w:tc>
+          <w:tcPr>
+            <w:tcW w:type="dxa" w:w="1077"/>
+          </w:tcPr>
+          <w:p>
+            <w:pPr>
+              <w:spacing w:after="20"/>
+            </w:pPr>
+            <w:r/>
+            <w:r>
+              <w:rPr>
+                <w:sz w:val="16"/>
+              </w:rPr>
+              <w:t>26.3</w:t>
+            </w:r>
+          </w:p>
+        </w:tc>
+        <w:tc>
+          <w:tcPr>
+            <w:tcW w:type="dxa" w:w="1247"/>
+          </w:tcPr>
+          <w:p>
+            <w:pPr>
+              <w:spacing w:after="20"/>
+            </w:pPr>
+            <w:r/>
+            <w:r>
+              <w:rPr>
+                <w:sz w:val="16"/>
+              </w:rPr>
+              <w:t>21.1</w:t>
+            </w:r>
+          </w:p>
+        </w:tc>
+        <w:tc>
+          <w:tcPr>
+            <w:tcW w:type="dxa" w:w="1077"/>
+          </w:tcPr>
+          <w:p>
+            <w:pPr>
+              <w:spacing w:after="20"/>
+            </w:pPr>
+            <w:r/>
+            <w:r>
+              <w:rPr>
+                <w:sz w:val="16"/>
+              </w:rPr>
+              <w:t>0.0</w:t>
+            </w:r>
+          </w:p>
+        </w:tc>
+        <w:tc>
+          <w:tcPr>
+            <w:tcW w:type="dxa" w:w="1247"/>
+          </w:tcPr>
+          <w:p>
+            <w:pPr>
+              <w:spacing w:after="20"/>
+            </w:pPr>
+            <w:r/>
+            <w:r>
+              <w:rPr>
+                <w:sz w:val="16"/>
+              </w:rPr>
+              <w:t>0.0</w:t>
+            </w:r>
+          </w:p>
+        </w:tc>
+        <w:tc>
+          <w:tcPr>
+            <w:tcW w:type="dxa" w:w="2041"/>
+          </w:tcPr>
+          <w:p>
+            <w:pPr>
+              <w:spacing w:after="20"/>
+            </w:pPr>
+            <w:r/>
+            <w:r>
+              <w:rPr>
+                <w:sz w:val="16"/>
+              </w:rPr>
+              <w:t>+21.1 [5.3, 42.1]</w:t>
+            </w:r>
+          </w:p>
+        </w:tc>
+      </w:tr>
+      <w:tr>
+        <w:tc>
+          <w:tcPr>
+            <w:tcW w:type="dxa" w:w="2835"/>
+          </w:tcPr>
+          <w:p>
+            <w:pPr>
+              <w:spacing w:after="20"/>
+            </w:pPr>
+            <w:r/>
+            <w:r>
+              <w:rPr>
+                <w:sz w:val="16"/>
+              </w:rPr>
+              <w:t>Pooled 7-8B (text rule)</w:t>
+            </w:r>
+          </w:p>
+        </w:tc>
+        <w:tc>
+          <w:tcPr>
+            <w:tcW w:type="dxa" w:w="1077"/>
+          </w:tcPr>
+          <w:p>
+            <w:pPr>
+              <w:spacing w:after="20"/>
+            </w:pPr>
+            <w:r/>
+            <w:r>
+              <w:rPr>
+                <w:sz w:val="16"/>
+              </w:rPr>
+              <w:t>31.6</w:t>
+            </w:r>
+          </w:p>
+        </w:tc>
+        <w:tc>
+          <w:tcPr>
+            <w:tcW w:type="dxa" w:w="1247"/>
+          </w:tcPr>
+          <w:p>
+            <w:pPr>
+              <w:spacing w:after="20"/>
+            </w:pPr>
+            <w:r/>
+            <w:r>
+              <w:rPr>
+                <w:sz w:val="16"/>
+              </w:rPr>
+              <w:t>24.6</w:t>
+            </w:r>
+          </w:p>
+        </w:tc>
+        <w:tc>
+          <w:tcPr>
+            <w:tcW w:type="dxa" w:w="1077"/>
+          </w:tcPr>
+          <w:p>
+            <w:pPr>
+              <w:spacing w:after="20"/>
+            </w:pPr>
+            <w:r/>
+            <w:r>
+              <w:rPr>
+                <w:sz w:val="16"/>
+              </w:rPr>
+              <w:t>0.0</w:t>
+            </w:r>
+          </w:p>
+        </w:tc>
+        <w:tc>
+          <w:tcPr>
+            <w:tcW w:type="dxa" w:w="1247"/>
+          </w:tcPr>
+          <w:p>
+            <w:pPr>
+              <w:spacing w:after="20"/>
+            </w:pPr>
+            <w:r/>
+            <w:r>
+              <w:rPr>
+                <w:sz w:val="16"/>
+              </w:rPr>
+              <w:t>0.0</w:t>
+            </w:r>
+          </w:p>
+        </w:tc>
+        <w:tc>
+          <w:tcPr>
+            <w:tcW w:type="dxa" w:w="2041"/>
+          </w:tcPr>
+          <w:p>
+            <w:pPr>
+              <w:spacing w:after="20"/>
+            </w:pPr>
+            <w:r/>
+            <w:r>
+              <w:rPr>
+                <w:sz w:val="16"/>
+              </w:rPr>
+              <w:t>+24.6 [8.8, 42.1]</w:t>
+            </w:r>
+          </w:p>
+        </w:tc>
+      </w:tr>
+      <w:tr>
+        <w:tc>
+          <w:tcPr>
+            <w:tcW w:type="dxa" w:w="2835"/>
+          </w:tcPr>
+          <w:p>
+            <w:pPr>
+              <w:spacing w:after="20"/>
+            </w:pPr>
+            <w:r/>
+            <w:r>
+              <w:rPr>
+                <w:sz w:val="16"/>
+              </w:rPr>
+              <w:t>Llama-3.1-8B (judge rule, 54 events)</w:t>
+            </w:r>
+          </w:p>
+        </w:tc>
+        <w:tc>
+          <w:tcPr>
+            <w:tcW w:type="dxa" w:w="1077"/>
+          </w:tcPr>
+          <w:p>
+            <w:pPr>
+              <w:spacing w:after="20"/>
+            </w:pPr>
+            <w:r/>
+            <w:r>
+              <w:rPr>
+                <w:sz w:val="16"/>
+              </w:rPr>
+              <w:t>27.8</w:t>
+            </w:r>
+          </w:p>
+        </w:tc>
+        <w:tc>
+          <w:tcPr>
+            <w:tcW w:type="dxa" w:w="1247"/>
+          </w:tcPr>
+          <w:p>
+            <w:pPr>
+              <w:spacing w:after="20"/>
+            </w:pPr>
+            <w:r/>
+            <w:r>
+              <w:rPr>
+                <w:sz w:val="16"/>
+              </w:rPr>
+              <w:t>27.8</w:t>
+            </w:r>
+          </w:p>
+        </w:tc>
+        <w:tc>
+          <w:tcPr>
+            <w:tcW w:type="dxa" w:w="1077"/>
+          </w:tcPr>
+          <w:p>
+            <w:pPr>
+              <w:spacing w:after="20"/>
+            </w:pPr>
+            <w:r/>
+            <w:r>
+              <w:rPr>
+                <w:sz w:val="16"/>
+              </w:rPr>
+              <w:t>3.7</w:t>
+            </w:r>
+          </w:p>
+        </w:tc>
+        <w:tc>
+          <w:tcPr>
+            <w:tcW w:type="dxa" w:w="1247"/>
+          </w:tcPr>
+          <w:p>
+            <w:pPr>
+              <w:spacing w:after="20"/>
+            </w:pPr>
+            <w:r/>
+            <w:r>
+              <w:rPr>
+                <w:sz w:val="16"/>
+              </w:rPr>
+              <w:t>3.7</w:t>
+            </w:r>
+          </w:p>
+        </w:tc>
+        <w:tc>
+          <w:tcPr>
+            <w:tcW w:type="dxa" w:w="2041"/>
+          </w:tcPr>
+          <w:p>
+            <w:pPr>
+              <w:spacing w:after="20"/>
+            </w:pPr>
+            <w:r/>
+            <w:r>
+              <w:rPr>
+                <w:sz w:val="16"/>
+              </w:rPr>
+              <w:t>+24.1 [11.1, 37.0]</w:t>
+            </w:r>
+          </w:p>
+        </w:tc>
+      </w:tr>
+      <w:tr>
+        <w:tc>
+          <w:tcPr>
+            <w:tcW w:type="dxa" w:w="2835"/>
+          </w:tcPr>
+          <w:p>
+            <w:pPr>
+              <w:spacing w:after="20"/>
+            </w:pPr>
+            <w:r/>
+            <w:r>
+              <w:rPr>
+                <w:sz w:val="16"/>
+              </w:rPr>
+              <w:t>Mistral-7B (judge rule, 54 events)</w:t>
+            </w:r>
+          </w:p>
+        </w:tc>
+        <w:tc>
+          <w:tcPr>
+            <w:tcW w:type="dxa" w:w="1077"/>
+          </w:tcPr>
+          <w:p>
+            <w:pPr>
+              <w:spacing w:after="20"/>
+            </w:pPr>
+            <w:r/>
+            <w:r>
+              <w:rPr>
+                <w:sz w:val="16"/>
+              </w:rPr>
+              <w:t>13.0</w:t>
+            </w:r>
+          </w:p>
+        </w:tc>
+        <w:tc>
+          <w:tcPr>
+            <w:tcW w:type="dxa" w:w="1247"/>
+          </w:tcPr>
+          <w:p>
+            <w:pPr>
+              <w:spacing w:after="20"/>
+            </w:pPr>
+            <w:r/>
+            <w:r>
+              <w:rPr>
+                <w:sz w:val="16"/>
+              </w:rPr>
+              <w:t>11.1</w:t>
+            </w:r>
+          </w:p>
+        </w:tc>
+        <w:tc>
+          <w:tcPr>
+            <w:tcW w:type="dxa" w:w="1077"/>
+          </w:tcPr>
+          <w:p>
+            <w:pPr>
+              <w:spacing w:after="20"/>
+            </w:pPr>
+            <w:r/>
+            <w:r>
+              <w:rPr>
+                <w:sz w:val="16"/>
+              </w:rPr>
+              <w:t>5.6</w:t>
+            </w:r>
+          </w:p>
+        </w:tc>
+        <w:tc>
+          <w:tcPr>
+            <w:tcW w:type="dxa" w:w="1247"/>
+          </w:tcPr>
+          <w:p>
+            <w:pPr>
+              <w:spacing w:after="20"/>
+            </w:pPr>
+            <w:r/>
+            <w:r>
+              <w:rPr>
+                <w:sz w:val="16"/>
+              </w:rPr>
+              <w:t>0.0</w:t>
+            </w:r>
+          </w:p>
+        </w:tc>
+        <w:tc>
+          <w:tcPr>
+            <w:tcW w:type="dxa" w:w="2041"/>
+          </w:tcPr>
+          <w:p>
+            <w:pPr>
+              <w:spacing w:after="20"/>
+            </w:pPr>
+            <w:r/>
+            <w:r>
+              <w:rPr>
+                <w:sz w:val="16"/>
+              </w:rPr>
+              <w:t>+11.1 [3.7, 20.4]</w:t>
+            </w:r>
+          </w:p>
+        </w:tc>
+      </w:tr>
+      <w:tr>
+        <w:tc>
+          <w:tcPr>
+            <w:tcW w:type="dxa" w:w="2835"/>
+          </w:tcPr>
+          <w:p>
+            <w:pPr>
+              <w:spacing w:after="20"/>
+            </w:pPr>
+            <w:r/>
+            <w:r>
+              <w:rPr>
+                <w:sz w:val="16"/>
+              </w:rPr>
+              <w:t>Qwen2.5-7B (judge rule, 54 events)</w:t>
+            </w:r>
+          </w:p>
+        </w:tc>
+        <w:tc>
+          <w:tcPr>
+            <w:tcW w:type="dxa" w:w="1077"/>
+          </w:tcPr>
+          <w:p>
+            <w:pPr>
+              <w:spacing w:after="20"/>
+            </w:pPr>
+            <w:r/>
+            <w:r>
+              <w:rPr>
+                <w:sz w:val="16"/>
+              </w:rPr>
+              <w:t>16.7</w:t>
+            </w:r>
+          </w:p>
+        </w:tc>
+        <w:tc>
+          <w:tcPr>
+            <w:tcW w:type="dxa" w:w="1247"/>
+          </w:tcPr>
+          <w:p>
+            <w:pPr>
+              <w:spacing w:after="20"/>
+            </w:pPr>
+            <w:r/>
+            <w:r>
+              <w:rPr>
+                <w:sz w:val="16"/>
+              </w:rPr>
+              <w:t>16.7</w:t>
+            </w:r>
+          </w:p>
+        </w:tc>
+        <w:tc>
+          <w:tcPr>
+            <w:tcW w:type="dxa" w:w="1077"/>
+          </w:tcPr>
+          <w:p>
+            <w:pPr>
+              <w:spacing w:after="20"/>
+            </w:pPr>
+            <w:r/>
+            <w:r>
+              <w:rPr>
+                <w:sz w:val="16"/>
+              </w:rPr>
+              <w:t>1.9</w:t>
+            </w:r>
+          </w:p>
+        </w:tc>
+        <w:tc>
+          <w:tcPr>
+            <w:tcW w:type="dxa" w:w="1247"/>
+          </w:tcPr>
+          <w:p>
+            <w:pPr>
+              <w:spacing w:after="20"/>
+            </w:pPr>
+            <w:r/>
+            <w:r>
+              <w:rPr>
+                <w:sz w:val="16"/>
+              </w:rPr>
+              <w:t>0.0</w:t>
+            </w:r>
+          </w:p>
+        </w:tc>
+        <w:tc>
+          <w:tcPr>
+            <w:tcW w:type="dxa" w:w="2041"/>
+          </w:tcPr>
+          <w:p>
+            <w:pPr>
+              <w:spacing w:after="20"/>
+            </w:pPr>
+            <w:r/>
+            <w:r>
+              <w:rPr>
+                <w:sz w:val="16"/>
+              </w:rPr>
+              <w:t>+16.7 [7.4, 27.8]</w:t>
+            </w:r>
+          </w:p>
+        </w:tc>
+      </w:tr>
+      <w:tr>
+        <w:tc>
+          <w:tcPr>
+            <w:tcW w:type="dxa" w:w="2835"/>
+          </w:tcPr>
+          <w:p>
+            <w:pPr>
+              <w:spacing w:after="20"/>
+            </w:pPr>
+            <w:r/>
+            <w:r>
+              <w:rPr>
+                <w:sz w:val="16"/>
+              </w:rPr>
+              <w:t>Pooled 7-8B (judge rule)</w:t>
+            </w:r>
+          </w:p>
+        </w:tc>
+        <w:tc>
+          <w:tcPr>
+            <w:tcW w:type="dxa" w:w="1077"/>
+          </w:tcPr>
+          <w:p>
+            <w:pPr>
+              <w:spacing w:after="20"/>
+            </w:pPr>
+            <w:r/>
+            <w:r>
+              <w:rPr>
+                <w:sz w:val="16"/>
+              </w:rPr>
+              <w:t>19.1</w:t>
+            </w:r>
+          </w:p>
+        </w:tc>
+        <w:tc>
+          <w:tcPr>
+            <w:tcW w:type="dxa" w:w="1247"/>
+          </w:tcPr>
+          <w:p>
+            <w:pPr>
+              <w:spacing w:after="20"/>
+            </w:pPr>
+            <w:r/>
+            <w:r>
+              <w:rPr>
+                <w:sz w:val="16"/>
+              </w:rPr>
+              <w:t>18.5</w:t>
+            </w:r>
+          </w:p>
+        </w:tc>
+        <w:tc>
+          <w:tcPr>
+            <w:tcW w:type="dxa" w:w="1077"/>
+          </w:tcPr>
+          <w:p>
+            <w:pPr>
+              <w:spacing w:after="20"/>
+            </w:pPr>
+            <w:r/>
+            <w:r>
+              <w:rPr>
+                <w:sz w:val="16"/>
+              </w:rPr>
+              <w:t>3.7</w:t>
+            </w:r>
+          </w:p>
+        </w:tc>
+        <w:tc>
+          <w:tcPr>
+            <w:tcW w:type="dxa" w:w="1247"/>
+          </w:tcPr>
+          <w:p>
+            <w:pPr>
+              <w:spacing w:after="20"/>
+            </w:pPr>
+            <w:r/>
+            <w:r>
+              <w:rPr>
+                <w:sz w:val="16"/>
+              </w:rPr>
+              <w:t>1.2</w:t>
+            </w:r>
+          </w:p>
+        </w:tc>
+        <w:tc>
+          <w:tcPr>
+            <w:tcW w:type="dxa" w:w="2041"/>
+          </w:tcPr>
+          <w:p>
+            <w:pPr>
+              <w:spacing w:after="20"/>
+            </w:pPr>
+            <w:r/>
+            <w:r>
+              <w:rPr>
+                <w:sz w:val="16"/>
+              </w:rPr>
+              <w:t>+17.3 [9.3, 26.5]</w:t>
+            </w:r>
+          </w:p>
+        </w:tc>
+      </w:tr>
+    </w:tbl>
+    <w:p>
+      <w:pPr>
+        <w:spacing w:after="40"/>
+      </w:pPr>
+    </w:p>
+    <w:p>
+      <w:pPr>
+        <w:jc w:val="both"/>
+      </w:pPr>
+      <w:r>
+        <w:rPr>
+          <w:b/>
+          <w:sz w:val="19"/>
+        </w:rPr>
+        <w:t>Reading Table 10c.</w:t>
+      </w:r>
+      <w:r>
+        <w:rPr>
+          <w:sz w:val="19"/>
+        </w:rPr>
+        <w:t xml:space="preserve"> The whole-volume card names the hidden identity early in 18.5% of events by the judge rule and 24.6% by the strict text rule, on names no model has seen, so the leak comes from the build and not from memory; the pre-registered input-channel test is supported on the strict rule and supported on the judge rule. The versioned card leaks in 1.2% (renamed) and 3.7% (original names), and it costs one extra card build per reader position with cards of similar length. The memory-only leak (prefix card, original minus renamed names) is +2.5 points for these 7-8B models.</w:t>
       </w:r>
     </w:p>
     <w:p>

</xml_diff>

<commit_message>
course: final rebuild with RF-E2E results of five models
</commit_message>
<xml_diff>
--- a/Project_Document.docx
+++ b/Project_Document.docx
@@ -10070,6 +10070,630 @@
           </w:p>
         </w:tc>
       </w:tr>
+      <w:tr>
+        <w:tc>
+          <w:tcPr>
+            <w:tcW w:type="dxa" w:w="2835"/>
+          </w:tcPr>
+          <w:p>
+            <w:pPr>
+              <w:spacing w:after="20"/>
+            </w:pPr>
+            <w:r/>
+            <w:r>
+              <w:rPr>
+                <w:sz w:val="16"/>
+              </w:rPr>
+              <w:t>Mistral-Small-24B (text rule, 19 events)</w:t>
+            </w:r>
+          </w:p>
+        </w:tc>
+        <w:tc>
+          <w:tcPr>
+            <w:tcW w:type="dxa" w:w="1077"/>
+          </w:tcPr>
+          <w:p>
+            <w:pPr>
+              <w:spacing w:after="20"/>
+            </w:pPr>
+            <w:r/>
+            <w:r>
+              <w:rPr>
+                <w:sz w:val="16"/>
+              </w:rPr>
+              <w:t>26.3</w:t>
+            </w:r>
+          </w:p>
+        </w:tc>
+        <w:tc>
+          <w:tcPr>
+            <w:tcW w:type="dxa" w:w="1247"/>
+          </w:tcPr>
+          <w:p>
+            <w:pPr>
+              <w:spacing w:after="20"/>
+            </w:pPr>
+            <w:r/>
+            <w:r>
+              <w:rPr>
+                <w:sz w:val="16"/>
+              </w:rPr>
+              <w:t>26.3</w:t>
+            </w:r>
+          </w:p>
+        </w:tc>
+        <w:tc>
+          <w:tcPr>
+            <w:tcW w:type="dxa" w:w="1077"/>
+          </w:tcPr>
+          <w:p>
+            <w:pPr>
+              <w:spacing w:after="20"/>
+            </w:pPr>
+            <w:r/>
+            <w:r>
+              <w:rPr>
+                <w:sz w:val="16"/>
+              </w:rPr>
+              <w:t>0.0</w:t>
+            </w:r>
+          </w:p>
+        </w:tc>
+        <w:tc>
+          <w:tcPr>
+            <w:tcW w:type="dxa" w:w="1247"/>
+          </w:tcPr>
+          <w:p>
+            <w:pPr>
+              <w:spacing w:after="20"/>
+            </w:pPr>
+            <w:r/>
+            <w:r>
+              <w:rPr>
+                <w:sz w:val="16"/>
+              </w:rPr>
+              <w:t>0.0</w:t>
+            </w:r>
+          </w:p>
+        </w:tc>
+        <w:tc>
+          <w:tcPr>
+            <w:tcW w:type="dxa" w:w="2041"/>
+          </w:tcPr>
+          <w:p>
+            <w:pPr>
+              <w:spacing w:after="20"/>
+            </w:pPr>
+            <w:r/>
+            <w:r>
+              <w:rPr>
+                <w:sz w:val="16"/>
+              </w:rPr>
+              <w:t>+26.3 [5.3, 47.4]</w:t>
+            </w:r>
+          </w:p>
+        </w:tc>
+      </w:tr>
+      <w:tr>
+        <w:tc>
+          <w:tcPr>
+            <w:tcW w:type="dxa" w:w="2835"/>
+          </w:tcPr>
+          <w:p>
+            <w:pPr>
+              <w:spacing w:after="20"/>
+            </w:pPr>
+            <w:r/>
+            <w:r>
+              <w:rPr>
+                <w:sz w:val="16"/>
+              </w:rPr>
+              <w:t>Qwen2.5-32B (text rule, 19 events)</w:t>
+            </w:r>
+          </w:p>
+        </w:tc>
+        <w:tc>
+          <w:tcPr>
+            <w:tcW w:type="dxa" w:w="1077"/>
+          </w:tcPr>
+          <w:p>
+            <w:pPr>
+              <w:spacing w:after="20"/>
+            </w:pPr>
+            <w:r/>
+            <w:r>
+              <w:rPr>
+                <w:sz w:val="16"/>
+              </w:rPr>
+              <w:t>15.8</w:t>
+            </w:r>
+          </w:p>
+        </w:tc>
+        <w:tc>
+          <w:tcPr>
+            <w:tcW w:type="dxa" w:w="1247"/>
+          </w:tcPr>
+          <w:p>
+            <w:pPr>
+              <w:spacing w:after="20"/>
+            </w:pPr>
+            <w:r/>
+            <w:r>
+              <w:rPr>
+                <w:sz w:val="16"/>
+              </w:rPr>
+              <w:t>15.8</w:t>
+            </w:r>
+          </w:p>
+        </w:tc>
+        <w:tc>
+          <w:tcPr>
+            <w:tcW w:type="dxa" w:w="1077"/>
+          </w:tcPr>
+          <w:p>
+            <w:pPr>
+              <w:spacing w:after="20"/>
+            </w:pPr>
+            <w:r/>
+            <w:r>
+              <w:rPr>
+                <w:sz w:val="16"/>
+              </w:rPr>
+              <w:t>0.0</w:t>
+            </w:r>
+          </w:p>
+        </w:tc>
+        <w:tc>
+          <w:tcPr>
+            <w:tcW w:type="dxa" w:w="1247"/>
+          </w:tcPr>
+          <w:p>
+            <w:pPr>
+              <w:spacing w:after="20"/>
+            </w:pPr>
+            <w:r/>
+            <w:r>
+              <w:rPr>
+                <w:sz w:val="16"/>
+              </w:rPr>
+              <w:t>0.0</w:t>
+            </w:r>
+          </w:p>
+        </w:tc>
+        <w:tc>
+          <w:tcPr>
+            <w:tcW w:type="dxa" w:w="2041"/>
+          </w:tcPr>
+          <w:p>
+            <w:pPr>
+              <w:spacing w:after="20"/>
+            </w:pPr>
+            <w:r/>
+            <w:r>
+              <w:rPr>
+                <w:sz w:val="16"/>
+              </w:rPr>
+              <w:t>+15.8 [0.0, 31.6]</w:t>
+            </w:r>
+          </w:p>
+        </w:tc>
+      </w:tr>
+      <w:tr>
+        <w:tc>
+          <w:tcPr>
+            <w:tcW w:type="dxa" w:w="2835"/>
+          </w:tcPr>
+          <w:p>
+            <w:pPr>
+              <w:spacing w:after="20"/>
+            </w:pPr>
+            <w:r/>
+            <w:r>
+              <w:rPr>
+                <w:sz w:val="16"/>
+              </w:rPr>
+              <w:t>Pooled 24-32B (text rule)</w:t>
+            </w:r>
+          </w:p>
+        </w:tc>
+        <w:tc>
+          <w:tcPr>
+            <w:tcW w:type="dxa" w:w="1077"/>
+          </w:tcPr>
+          <w:p>
+            <w:pPr>
+              <w:spacing w:after="20"/>
+            </w:pPr>
+            <w:r/>
+            <w:r>
+              <w:rPr>
+                <w:sz w:val="16"/>
+              </w:rPr>
+              <w:t>21.1</w:t>
+            </w:r>
+          </w:p>
+        </w:tc>
+        <w:tc>
+          <w:tcPr>
+            <w:tcW w:type="dxa" w:w="1247"/>
+          </w:tcPr>
+          <w:p>
+            <w:pPr>
+              <w:spacing w:after="20"/>
+            </w:pPr>
+            <w:r/>
+            <w:r>
+              <w:rPr>
+                <w:sz w:val="16"/>
+              </w:rPr>
+              <w:t>21.1</w:t>
+            </w:r>
+          </w:p>
+        </w:tc>
+        <w:tc>
+          <w:tcPr>
+            <w:tcW w:type="dxa" w:w="1077"/>
+          </w:tcPr>
+          <w:p>
+            <w:pPr>
+              <w:spacing w:after="20"/>
+            </w:pPr>
+            <w:r/>
+            <w:r>
+              <w:rPr>
+                <w:sz w:val="16"/>
+              </w:rPr>
+              <w:t>0.0</w:t>
+            </w:r>
+          </w:p>
+        </w:tc>
+        <w:tc>
+          <w:tcPr>
+            <w:tcW w:type="dxa" w:w="1247"/>
+          </w:tcPr>
+          <w:p>
+            <w:pPr>
+              <w:spacing w:after="20"/>
+            </w:pPr>
+            <w:r/>
+            <w:r>
+              <w:rPr>
+                <w:sz w:val="16"/>
+              </w:rPr>
+              <w:t>0.0</w:t>
+            </w:r>
+          </w:p>
+        </w:tc>
+        <w:tc>
+          <w:tcPr>
+            <w:tcW w:type="dxa" w:w="2041"/>
+          </w:tcPr>
+          <w:p>
+            <w:pPr>
+              <w:spacing w:after="20"/>
+            </w:pPr>
+            <w:r/>
+            <w:r>
+              <w:rPr>
+                <w:sz w:val="16"/>
+              </w:rPr>
+              <w:t>+21.1 [5.3, 39.5]</w:t>
+            </w:r>
+          </w:p>
+        </w:tc>
+      </w:tr>
+      <w:tr>
+        <w:tc>
+          <w:tcPr>
+            <w:tcW w:type="dxa" w:w="2835"/>
+          </w:tcPr>
+          <w:p>
+            <w:pPr>
+              <w:spacing w:after="20"/>
+            </w:pPr>
+            <w:r/>
+            <w:r>
+              <w:rPr>
+                <w:sz w:val="16"/>
+              </w:rPr>
+              <w:t>Mistral-Small-24B (judge rule, 54 events)</w:t>
+            </w:r>
+          </w:p>
+        </w:tc>
+        <w:tc>
+          <w:tcPr>
+            <w:tcW w:type="dxa" w:w="1077"/>
+          </w:tcPr>
+          <w:p>
+            <w:pPr>
+              <w:spacing w:after="20"/>
+            </w:pPr>
+            <w:r/>
+            <w:r>
+              <w:rPr>
+                <w:sz w:val="16"/>
+              </w:rPr>
+              <w:t>27.8</w:t>
+            </w:r>
+          </w:p>
+        </w:tc>
+        <w:tc>
+          <w:tcPr>
+            <w:tcW w:type="dxa" w:w="1247"/>
+          </w:tcPr>
+          <w:p>
+            <w:pPr>
+              <w:spacing w:after="20"/>
+            </w:pPr>
+            <w:r/>
+            <w:r>
+              <w:rPr>
+                <w:sz w:val="16"/>
+              </w:rPr>
+              <w:t>31.5</w:t>
+            </w:r>
+          </w:p>
+        </w:tc>
+        <w:tc>
+          <w:tcPr>
+            <w:tcW w:type="dxa" w:w="1077"/>
+          </w:tcPr>
+          <w:p>
+            <w:pPr>
+              <w:spacing w:after="20"/>
+            </w:pPr>
+            <w:r/>
+            <w:r>
+              <w:rPr>
+                <w:sz w:val="16"/>
+              </w:rPr>
+              <w:t>1.9</w:t>
+            </w:r>
+          </w:p>
+        </w:tc>
+        <w:tc>
+          <w:tcPr>
+            <w:tcW w:type="dxa" w:w="1247"/>
+          </w:tcPr>
+          <w:p>
+            <w:pPr>
+              <w:spacing w:after="20"/>
+            </w:pPr>
+            <w:r/>
+            <w:r>
+              <w:rPr>
+                <w:sz w:val="16"/>
+              </w:rPr>
+              <w:t>3.7</w:t>
+            </w:r>
+          </w:p>
+        </w:tc>
+        <w:tc>
+          <w:tcPr>
+            <w:tcW w:type="dxa" w:w="2041"/>
+          </w:tcPr>
+          <w:p>
+            <w:pPr>
+              <w:spacing w:after="20"/>
+            </w:pPr>
+            <w:r/>
+            <w:r>
+              <w:rPr>
+                <w:sz w:val="16"/>
+              </w:rPr>
+              <w:t>+27.8 [16.7, 40.7]</w:t>
+            </w:r>
+          </w:p>
+        </w:tc>
+      </w:tr>
+      <w:tr>
+        <w:tc>
+          <w:tcPr>
+            <w:tcW w:type="dxa" w:w="2835"/>
+          </w:tcPr>
+          <w:p>
+            <w:pPr>
+              <w:spacing w:after="20"/>
+            </w:pPr>
+            <w:r/>
+            <w:r>
+              <w:rPr>
+                <w:sz w:val="16"/>
+              </w:rPr>
+              <w:t>Qwen2.5-32B (judge rule, 54 events)</w:t>
+            </w:r>
+          </w:p>
+        </w:tc>
+        <w:tc>
+          <w:tcPr>
+            <w:tcW w:type="dxa" w:w="1077"/>
+          </w:tcPr>
+          <w:p>
+            <w:pPr>
+              <w:spacing w:after="20"/>
+            </w:pPr>
+            <w:r/>
+            <w:r>
+              <w:rPr>
+                <w:sz w:val="16"/>
+              </w:rPr>
+              <w:t>14.8</w:t>
+            </w:r>
+          </w:p>
+        </w:tc>
+        <w:tc>
+          <w:tcPr>
+            <w:tcW w:type="dxa" w:w="1247"/>
+          </w:tcPr>
+          <w:p>
+            <w:pPr>
+              <w:spacing w:after="20"/>
+            </w:pPr>
+            <w:r/>
+            <w:r>
+              <w:rPr>
+                <w:sz w:val="16"/>
+              </w:rPr>
+              <w:t>14.8</w:t>
+            </w:r>
+          </w:p>
+        </w:tc>
+        <w:tc>
+          <w:tcPr>
+            <w:tcW w:type="dxa" w:w="1077"/>
+          </w:tcPr>
+          <w:p>
+            <w:pPr>
+              <w:spacing w:after="20"/>
+            </w:pPr>
+            <w:r/>
+            <w:r>
+              <w:rPr>
+                <w:sz w:val="16"/>
+              </w:rPr>
+              <w:t>1.9</w:t>
+            </w:r>
+          </w:p>
+        </w:tc>
+        <w:tc>
+          <w:tcPr>
+            <w:tcW w:type="dxa" w:w="1247"/>
+          </w:tcPr>
+          <w:p>
+            <w:pPr>
+              <w:spacing w:after="20"/>
+            </w:pPr>
+            <w:r/>
+            <w:r>
+              <w:rPr>
+                <w:sz w:val="16"/>
+              </w:rPr>
+              <w:t>0.0</w:t>
+            </w:r>
+          </w:p>
+        </w:tc>
+        <w:tc>
+          <w:tcPr>
+            <w:tcW w:type="dxa" w:w="2041"/>
+          </w:tcPr>
+          <w:p>
+            <w:pPr>
+              <w:spacing w:after="20"/>
+            </w:pPr>
+            <w:r/>
+            <w:r>
+              <w:rPr>
+                <w:sz w:val="16"/>
+              </w:rPr>
+              <w:t>+14.8 [5.6, 24.1]</w:t>
+            </w:r>
+          </w:p>
+        </w:tc>
+      </w:tr>
+      <w:tr>
+        <w:tc>
+          <w:tcPr>
+            <w:tcW w:type="dxa" w:w="2835"/>
+          </w:tcPr>
+          <w:p>
+            <w:pPr>
+              <w:spacing w:after="20"/>
+            </w:pPr>
+            <w:r/>
+            <w:r>
+              <w:rPr>
+                <w:sz w:val="16"/>
+              </w:rPr>
+              <w:t>Pooled 24-32B (judge rule)</w:t>
+            </w:r>
+          </w:p>
+        </w:tc>
+        <w:tc>
+          <w:tcPr>
+            <w:tcW w:type="dxa" w:w="1077"/>
+          </w:tcPr>
+          <w:p>
+            <w:pPr>
+              <w:spacing w:after="20"/>
+            </w:pPr>
+            <w:r/>
+            <w:r>
+              <w:rPr>
+                <w:sz w:val="16"/>
+              </w:rPr>
+              <w:t>21.3</w:t>
+            </w:r>
+          </w:p>
+        </w:tc>
+        <w:tc>
+          <w:tcPr>
+            <w:tcW w:type="dxa" w:w="1247"/>
+          </w:tcPr>
+          <w:p>
+            <w:pPr>
+              <w:spacing w:after="20"/>
+            </w:pPr>
+            <w:r/>
+            <w:r>
+              <w:rPr>
+                <w:sz w:val="16"/>
+              </w:rPr>
+              <w:t>23.1</w:t>
+            </w:r>
+          </w:p>
+        </w:tc>
+        <w:tc>
+          <w:tcPr>
+            <w:tcW w:type="dxa" w:w="1077"/>
+          </w:tcPr>
+          <w:p>
+            <w:pPr>
+              <w:spacing w:after="20"/>
+            </w:pPr>
+            <w:r/>
+            <w:r>
+              <w:rPr>
+                <w:sz w:val="16"/>
+              </w:rPr>
+              <w:t>1.9</w:t>
+            </w:r>
+          </w:p>
+        </w:tc>
+        <w:tc>
+          <w:tcPr>
+            <w:tcW w:type="dxa" w:w="1247"/>
+          </w:tcPr>
+          <w:p>
+            <w:pPr>
+              <w:spacing w:after="20"/>
+            </w:pPr>
+            <w:r/>
+            <w:r>
+              <w:rPr>
+                <w:sz w:val="16"/>
+              </w:rPr>
+              <w:t>1.9</w:t>
+            </w:r>
+          </w:p>
+        </w:tc>
+        <w:tc>
+          <w:tcPr>
+            <w:tcW w:type="dxa" w:w="2041"/>
+          </w:tcPr>
+          <w:p>
+            <w:pPr>
+              <w:spacing w:after="20"/>
+            </w:pPr>
+            <w:r/>
+            <w:r>
+              <w:rPr>
+                <w:sz w:val="16"/>
+              </w:rPr>
+              <w:t>+21.3 [13.0, 30.6]</w:t>
+            </w:r>
+          </w:p>
+        </w:tc>
+      </w:tr>
     </w:tbl>
     <w:p>
       <w:pPr>
@@ -10091,7 +10715,7 @@
         <w:rPr>
           <w:sz w:val="19"/>
         </w:rPr>
-        <w:t xml:space="preserve"> The whole-volume card names the hidden identity early in 18.5% of events by the judge rule and 24.6% by the strict text rule, on names no model has seen, so the leak comes from the build and not from memory; the pre-registered input-channel test is supported on the strict rule and supported on the judge rule. The versioned card leaks in 1.2% (renamed) and 3.7% (original names), and it costs one extra card build per reader position with cards of similar length. The memory-only leak (prefix card, original minus renamed names) is +2.5 points for these 7-8B models.</w:t>
+        <w:t xml:space="preserve"> The whole-volume card names the hidden identity early in 18.5% of events by the judge rule and 24.6% by the strict text rule, on names no model has seen, so the leak comes from the build and not from memory; the pre-registered input-channel test is supported on the strict rule and supported on the judge rule. The versioned card leaks in 1.2% (renamed) and 3.7% (original names), and it costs one extra card build per reader position with cards of similar length. The memory-only leak (prefix card, original minus renamed names) is +2.5 points for these 7-8B models. Pseudonymising the passages and mapping names back changed the prefix card's leak from 3.7% to 3.1%. On the larger 24-32B models the whole-volume card leaked in 23.1% of events on cipher names against 1.9% for the versioned card, with a memory-only leak of +0.0 points.</w:t>
       </w:r>
     </w:p>
     <w:p>

</xml_diff>

<commit_message>
course: VIT logo on the title page, title reframed around reader-faithfulness; RF-E2E analysis adds the second-judge summary
</commit_message>
<xml_diff>
--- a/Project_Document.docx
+++ b/Project_Document.docx
@@ -2,6 +2,45 @@
 <file path=word/document.xml><?xml version="1.0" encoding="utf-8"?>
 <w:document xmlns:wpc="http://schemas.microsoft.com/office/word/2010/wordprocessingCanvas" xmlns:mo="http://schemas.microsoft.com/office/mac/office/2008/main" xmlns:mc="http://schemas.openxmlformats.org/markup-compatibility/2006" xmlns:mv="urn:schemas-microsoft-com:mac:vml" xmlns:o="urn:schemas-microsoft-com:office:office" xmlns:r="http://schemas.openxmlformats.org/officeDocument/2006/relationships" xmlns:m="http://schemas.openxmlformats.org/officeDocument/2006/math" xmlns:v="urn:schemas-microsoft-com:vml" xmlns:wp14="http://schemas.microsoft.com/office/word/2010/wordprocessingDrawing" xmlns:wp="http://schemas.openxmlformats.org/drawingml/2006/wordprocessingDrawing" xmlns:w10="urn:schemas-microsoft-com:office:word" xmlns:w="http://schemas.openxmlformats.org/wordprocessingml/2006/main" xmlns:w14="http://schemas.microsoft.com/office/word/2010/wordml" xmlns:wpg="http://schemas.microsoft.com/office/word/2010/wordprocessingGroup" xmlns:wpi="http://schemas.microsoft.com/office/word/2010/wordprocessingInk" xmlns:wne="http://schemas.microsoft.com/office/word/2006/wordml" xmlns:wps="http://schemas.microsoft.com/office/word/2010/wordprocessingShape" mc:Ignorable="w14 wp14">
   <w:body>
+    <w:p>
+      <w:pPr>
+        <w:jc w:val="center"/>
+      </w:pPr>
+      <w:r>
+        <w:drawing>
+          <wp:inline xmlns:a="http://schemas.openxmlformats.org/drawingml/2006/main" xmlns:pic="http://schemas.openxmlformats.org/drawingml/2006/picture">
+            <wp:extent cx="2700000" cy="726750"/>
+            <wp:docPr id="1" name="Picture 1"/>
+            <wp:cNvGraphicFramePr>
+              <a:graphicFrameLocks noChangeAspect="1"/>
+            </wp:cNvGraphicFramePr>
+            <a:graphic>
+              <a:graphicData uri="http://schemas.openxmlformats.org/drawingml/2006/picture">
+                <pic:pic>
+                  <pic:nvPicPr>
+                    <pic:cNvPr id="0" name="vit_logo.png"/>
+                    <pic:cNvPicPr/>
+                  </pic:nvPicPr>
+                  <pic:blipFill>
+                    <a:blip r:embed="rId11"/>
+                    <a:stretch>
+                      <a:fillRect/>
+                    </a:stretch>
+                  </pic:blipFill>
+                  <pic:spPr>
+                    <a:xfrm>
+                      <a:off x="0" y="0"/>
+                      <a:ext cx="2700000" cy="726750"/>
+                    </a:xfrm>
+                    <a:prstGeom prst="rect"/>
+                  </pic:spPr>
+                </pic:pic>
+              </a:graphicData>
+            </a:graphic>
+          </wp:inline>
+        </w:drawing>
+      </w:r>
+    </w:p>
     <w:p/>
     <w:p/>
     <w:p>
@@ -83,7 +122,7 @@
           <w:b/>
           <w:sz w:val="34"/>
         </w:rPr>
-        <w:t>Do Language Models Peek Ahead? Measuring Name-Keyed Memory Leakage When LLMs Read Serialised Fiction, on a Reader-Scoped Narrative Knowledge Graph (EchoTales)</w:t>
+        <w:t>Do Reading Assistants Peek Ahead? Reader-Faithfulness: Detecting and Fixing Look-Ahead Leaks from the Pipeline and from Model Memory (EchoTales)</w:t>
       </w:r>
     </w:p>
     <w:p/>
@@ -5815,7 +5854,7 @@
         <w:drawing>
           <wp:inline xmlns:a="http://schemas.openxmlformats.org/drawingml/2006/main" xmlns:pic="http://schemas.openxmlformats.org/drawingml/2006/picture">
             <wp:extent cx="5903999" cy="3398168"/>
-            <wp:docPr id="1" name="Picture 1"/>
+            <wp:docPr id="2" name="Picture 2"/>
             <wp:cNvGraphicFramePr>
               <a:graphicFrameLocks noChangeAspect="1"/>
             </wp:cNvGraphicFramePr>
@@ -5827,7 +5866,7 @@
                     <pic:cNvPicPr/>
                   </pic:nvPicPr>
                   <pic:blipFill>
-                    <a:blip r:embed="rId11"/>
+                    <a:blip r:embed="rId12"/>
                     <a:stretch>
                       <a:fillRect/>
                     </a:stretch>
@@ -5889,7 +5928,7 @@
         <w:drawing>
           <wp:inline xmlns:a="http://schemas.openxmlformats.org/drawingml/2006/main" xmlns:pic="http://schemas.openxmlformats.org/drawingml/2006/picture">
             <wp:extent cx="5220000" cy="2203694"/>
-            <wp:docPr id="2" name="Picture 2"/>
+            <wp:docPr id="3" name="Picture 3"/>
             <wp:cNvGraphicFramePr>
               <a:graphicFrameLocks noChangeAspect="1"/>
             </wp:cNvGraphicFramePr>
@@ -5901,7 +5940,7 @@
                     <pic:cNvPicPr/>
                   </pic:nvPicPr>
                   <pic:blipFill>
-                    <a:blip r:embed="rId12"/>
+                    <a:blip r:embed="rId13"/>
                     <a:stretch>
                       <a:fillRect/>
                     </a:stretch>
@@ -5986,7 +6025,7 @@
         <w:drawing>
           <wp:inline xmlns:a="http://schemas.openxmlformats.org/drawingml/2006/main" xmlns:pic="http://schemas.openxmlformats.org/drawingml/2006/picture">
             <wp:extent cx="5580000" cy="3114419"/>
-            <wp:docPr id="3" name="Picture 3"/>
+            <wp:docPr id="4" name="Picture 4"/>
             <wp:cNvGraphicFramePr>
               <a:graphicFrameLocks noChangeAspect="1"/>
             </wp:cNvGraphicFramePr>
@@ -5998,7 +6037,7 @@
                     <pic:cNvPicPr/>
                   </pic:nvPicPr>
                   <pic:blipFill>
-                    <a:blip r:embed="rId13"/>
+                    <a:blip r:embed="rId14"/>
                     <a:stretch>
                       <a:fillRect/>
                     </a:stretch>
@@ -6595,7 +6634,7 @@
         <w:drawing>
           <wp:inline xmlns:a="http://schemas.openxmlformats.org/drawingml/2006/main" xmlns:pic="http://schemas.openxmlformats.org/drawingml/2006/picture">
             <wp:extent cx="4140000" cy="2661429"/>
-            <wp:docPr id="4" name="Picture 4"/>
+            <wp:docPr id="5" name="Picture 5"/>
             <wp:cNvGraphicFramePr>
               <a:graphicFrameLocks noChangeAspect="1"/>
             </wp:cNvGraphicFramePr>
@@ -6607,7 +6646,7 @@
                     <pic:cNvPicPr/>
                   </pic:nvPicPr>
                   <pic:blipFill>
-                    <a:blip r:embed="rId14"/>
+                    <a:blip r:embed="rId15"/>
                     <a:stretch>
                       <a:fillRect/>
                     </a:stretch>
@@ -6655,7 +6694,7 @@
         <w:drawing>
           <wp:inline xmlns:a="http://schemas.openxmlformats.org/drawingml/2006/main" xmlns:pic="http://schemas.openxmlformats.org/drawingml/2006/picture">
             <wp:extent cx="5760000" cy="2592000"/>
-            <wp:docPr id="5" name="Picture 5"/>
+            <wp:docPr id="6" name="Picture 6"/>
             <wp:cNvGraphicFramePr>
               <a:graphicFrameLocks noChangeAspect="1"/>
             </wp:cNvGraphicFramePr>
@@ -6667,7 +6706,7 @@
                     <pic:cNvPicPr/>
                   </pic:nvPicPr>
                   <pic:blipFill>
-                    <a:blip r:embed="rId15"/>
+                    <a:blip r:embed="rId16"/>
                     <a:stretch>
                       <a:fillRect/>
                     </a:stretch>
@@ -7255,7 +7294,7 @@
         <w:drawing>
           <wp:inline xmlns:a="http://schemas.openxmlformats.org/drawingml/2006/main" xmlns:pic="http://schemas.openxmlformats.org/drawingml/2006/picture">
             <wp:extent cx="4608000" cy="2736000"/>
-            <wp:docPr id="6" name="Picture 6"/>
+            <wp:docPr id="7" name="Picture 7"/>
             <wp:cNvGraphicFramePr>
               <a:graphicFrameLocks noChangeAspect="1"/>
             </wp:cNvGraphicFramePr>
@@ -7267,7 +7306,7 @@
                     <pic:cNvPicPr/>
                   </pic:nvPicPr>
                   <pic:blipFill>
-                    <a:blip r:embed="rId16"/>
+                    <a:blip r:embed="rId17"/>
                     <a:stretch>
                       <a:fillRect/>
                     </a:stretch>
@@ -11698,7 +11737,7 @@
         <w:drawing>
           <wp:inline xmlns:a="http://schemas.openxmlformats.org/drawingml/2006/main" xmlns:pic="http://schemas.openxmlformats.org/drawingml/2006/picture">
             <wp:extent cx="5400000" cy="3375000"/>
-            <wp:docPr id="7" name="Picture 7"/>
+            <wp:docPr id="8" name="Picture 8"/>
             <wp:cNvGraphicFramePr>
               <a:graphicFrameLocks noChangeAspect="1"/>
             </wp:cNvGraphicFramePr>
@@ -11710,7 +11749,7 @@
                     <pic:cNvPicPr/>
                   </pic:nvPicPr>
                   <pic:blipFill>
-                    <a:blip r:embed="rId17"/>
+                    <a:blip r:embed="rId18"/>
                     <a:stretch>
                       <a:fillRect/>
                     </a:stretch>
@@ -11758,7 +11797,7 @@
         <w:drawing>
           <wp:inline xmlns:a="http://schemas.openxmlformats.org/drawingml/2006/main" xmlns:pic="http://schemas.openxmlformats.org/drawingml/2006/picture">
             <wp:extent cx="5400000" cy="3598567"/>
-            <wp:docPr id="8" name="Picture 8"/>
+            <wp:docPr id="9" name="Picture 9"/>
             <wp:cNvGraphicFramePr>
               <a:graphicFrameLocks noChangeAspect="1"/>
             </wp:cNvGraphicFramePr>
@@ -11770,7 +11809,7 @@
                     <pic:cNvPicPr/>
                   </pic:nvPicPr>
                   <pic:blipFill>
-                    <a:blip r:embed="rId18"/>
+                    <a:blip r:embed="rId19"/>
                     <a:stretch>
                       <a:fillRect/>
                     </a:stretch>
@@ -11818,7 +11857,7 @@
         <w:drawing>
           <wp:inline xmlns:a="http://schemas.openxmlformats.org/drawingml/2006/main" xmlns:pic="http://schemas.openxmlformats.org/drawingml/2006/picture">
             <wp:extent cx="5400000" cy="4871179"/>
-            <wp:docPr id="9" name="Picture 9"/>
+            <wp:docPr id="10" name="Picture 10"/>
             <wp:cNvGraphicFramePr>
               <a:graphicFrameLocks noChangeAspect="1"/>
             </wp:cNvGraphicFramePr>
@@ -11830,7 +11869,7 @@
                     <pic:cNvPicPr/>
                   </pic:nvPicPr>
                   <pic:blipFill>
-                    <a:blip r:embed="rId19"/>
+                    <a:blip r:embed="rId20"/>
                     <a:stretch>
                       <a:fillRect/>
                     </a:stretch>
@@ -11878,7 +11917,7 @@
         <w:drawing>
           <wp:inline xmlns:a="http://schemas.openxmlformats.org/drawingml/2006/main" xmlns:pic="http://schemas.openxmlformats.org/drawingml/2006/picture">
             <wp:extent cx="5400000" cy="3577070"/>
-            <wp:docPr id="10" name="Picture 10"/>
+            <wp:docPr id="11" name="Picture 11"/>
             <wp:cNvGraphicFramePr>
               <a:graphicFrameLocks noChangeAspect="1"/>
             </wp:cNvGraphicFramePr>
@@ -11890,7 +11929,7 @@
                     <pic:cNvPicPr/>
                   </pic:nvPicPr>
                   <pic:blipFill>
-                    <a:blip r:embed="rId20"/>
+                    <a:blip r:embed="rId21"/>
                     <a:stretch>
                       <a:fillRect/>
                     </a:stretch>

</xml_diff>

<commit_message>
course: presentation link in the appendix
</commit_message>
<xml_diff>
--- a/Project_Document.docx
+++ b/Project_Document.docx
@@ -12673,13 +12673,13 @@
           <w:b/>
           <w:sz w:val="19"/>
         </w:rPr>
-        <w:t>a) Presentation (PPT):</w:t>
+        <w:t>a) Link to the presentation (PPT):</w:t>
       </w:r>
       <w:r>
         <w:rPr>
           <w:sz w:val="19"/>
         </w:rPr>
-        <w:t xml:space="preserve"> EchoTales_Research_Presentation.pptx, submitted with this document.</w:t>
+        <w:t xml:space="preserve"> https://docs.google.com/presentation/d/1VUZjLmUKpjqdqs_lNCZzUkAgfXx_MQ68/edit?usp=sharing&amp;ouid=114180309837634233617&amp;rtpof=true&amp;sd=true</w:t>
       </w:r>
     </w:p>
     <w:p>

</xml_diff>

<commit_message>
course: video and source-code links in the appendix
</commit_message>
<xml_diff>
--- a/Project_Document.docx
+++ b/Project_Document.docx
@@ -12688,13 +12688,13 @@
           <w:b/>
           <w:sz w:val="19"/>
         </w:rPr>
-        <w:t>b) Demonstration video:</w:t>
+        <w:t>b) Link to the pre-recorded demonstration video:</w:t>
       </w:r>
       <w:r>
         <w:rPr>
           <w:sz w:val="19"/>
         </w:rPr>
-        <w:t xml:space="preserve"> the narration script is in Demo_Video_Script.docx.</w:t>
+        <w:t xml:space="preserve"> https://drive.google.com/file/d/1GgZj58td5UjoiB-gqE5oECHq3qWrB2aJ/view?usp=sharing</w:t>
       </w:r>
     </w:p>
     <w:p>
@@ -12703,13 +12703,13 @@
           <w:b/>
           <w:sz w:val="19"/>
         </w:rPr>
-        <w:t>c) Source files and steps to execute:</w:t>
+        <w:t>c) Link to the source files and the steps to execute:</w:t>
       </w:r>
       <w:r>
         <w:rPr>
           <w:sz w:val="19"/>
         </w:rPr>
-        <w:t xml:space="preserve"> the project repository, branch chimera/system-adapters. Steps are in docs/paper/project_doc/RUN_STEPS.md and summarised here:</w:t>
+        <w:t xml:space="preserve"> https://github.com/adhyan-jain/EchoTales/tree/chimera/system-adapters (branch chimera/system-adapters). Steps are in docs/paper/project_doc/RUN_STEPS.md and summarised here:</w:t>
       </w:r>
     </w:p>
     <w:p>

</xml_diff>

<commit_message>
course: unnumbered section headings, abstract split by label, name spelling, provenance note and branch name removed, final video and repository links
</commit_message>
<xml_diff>
--- a/Project_Document.docx
+++ b/Project_Document.docx
@@ -224,7 +224,7 @@
               <w:rPr>
                 <w:sz w:val="22"/>
               </w:rPr>
-              <w:t>Atharva Sheerh Pandey</w:t>
+              <w:t>Atharva Sheersh Pandey</w:t>
             </w:r>
           </w:p>
         </w:tc>
@@ -296,7 +296,7 @@
         <w:rPr>
           <w:sz w:val="18"/>
         </w:rPr>
-        <w:t>Submission: 16 October 2026   |   Repository: EchoTales (branch chimera/system-adapters)</w:t>
+        <w:t>Submission: 16 October 2026</w:t>
       </w:r>
     </w:p>
     <w:p>
@@ -315,11 +315,12 @@
           <w:color w:val="1F6FB5"/>
           <w:sz w:val="25"/>
         </w:rPr>
-        <w:t>[2]  Structured Abstract</w:t>
+        <w:t>Structured Abstract</w:t>
       </w:r>
     </w:p>
     <w:p>
       <w:pPr>
+        <w:spacing w:after="60"/>
         <w:jc w:val="both"/>
       </w:pPr>
       <w:r>
@@ -329,8 +330,14 @@
         <w:t>Background:</w:t>
       </w:r>
       <w:r>
-        <w:t xml:space="preserve"> Language models recap fiction for readers who have read only part of a book, and may name a disguised character too early. </w:t>
+        <w:t xml:space="preserve"> Language models recap fiction for readers who have read only part of a book, and may name a disguised character too early.</w:t>
       </w:r>
+    </w:p>
+    <w:p>
+      <w:pPr>
+        <w:spacing w:after="60"/>
+        <w:jc w:val="both"/>
+      </w:pPr>
       <w:r>
         <w:rPr>
           <w:b/>
@@ -338,8 +345,14 @@
         <w:t>Objective:</w:t>
       </w:r>
       <w:r>
-        <w:t xml:space="preserve"> Measure that leakage, test whether name memory rather than lost name cues causes it, and audit a narrative knowledge graph for the same property. </w:t>
+        <w:t xml:space="preserve"> Measure that leakage, test whether name memory rather than lost name cues causes it, and audit a narrative knowledge graph for the same property.</w:t>
       </w:r>
+    </w:p>
+    <w:p>
+      <w:pPr>
+        <w:spacing w:after="60"/>
+        <w:jc w:val="both"/>
+      </w:pPr>
       <w:r>
         <w:rPr>
           <w:b/>
@@ -347,8 +360,14 @@
         <w:t>Methods:</w:t>
       </w:r>
       <w:r>
-        <w:t xml:space="preserve"> From public-domain novels we built events in which a character known by an alias is later named; the book's own reveal sentence is the oracle. Mentions were shown with original names, a letter cipher and cue-preserving pseudonyms. Exploratory: 38 events, five local 7-9B models and one commercial model. Pre-registered confirmatory run: 68 events from 65 books, three open 24-32B models. </w:t>
+        <w:t xml:space="preserve"> From public-domain novels we built events in which a character known by an alias is later named; the book's own reveal sentence is the oracle. Mentions were shown with original names, a letter cipher and cue-preserving pseudonyms. Exploratory: 38 events, five local 7-9B models and one commercial model. Pre-registered confirmatory run: 68 events from 65 books, three open 24-32B models.</w:t>
       </w:r>
+    </w:p>
+    <w:p>
+      <w:pPr>
+        <w:spacing w:after="60"/>
+        <w:jc w:val="both"/>
+      </w:pPr>
       <w:r>
         <w:rPr>
           <w:b/>
@@ -356,8 +375,14 @@
         <w:t>Results:</w:t>
       </w:r>
       <w:r>
-        <w:t xml:space="preserve"> Exploratory: the reference model named the identity early more often with original names (gap +26.0 points, 95% CI [16.8, 36.0]); pseudonyms did not restore premature naming (recovered fraction -0.11); the gap rose with book familiarity. Confirmatory, on mostly obscure books: pooled gap +0.1 [-5.0, 5.2]; fame contrast +7.6 [-1.4, 18.3], p = 0.0595, not significant. The graph resolver was prefix-causal; its persona stage looked ahead for 8.0% of characters. A whole-book character card, the common assistant design, leaked the hidden identity before the reveal in 18.5% of events even under renamed names; a versioned card removed it (1.2%). </w:t>
+        <w:t xml:space="preserve"> Exploratory: the reference model named the identity early more often with original names (gap +26.0 points, 95% CI [16.8, 36.0]); pseudonyms did not restore premature naming (recovered fraction -0.11); the gap rose with book familiarity. Confirmatory, on mostly obscure books: pooled gap +0.1 [-5.0, 5.2]; fame contrast +7.6 [-1.4, 18.3], p = 0.0595, not significant. The graph resolver was prefix-causal; its persona stage looked ahead for 8.0% of characters. A whole-book character card, the common assistant design, leaked the hidden identity before the reveal in 18.5% of events even under renamed names; a versioned card removed it (1.2%).</w:t>
       </w:r>
+    </w:p>
+    <w:p>
+      <w:pPr>
+        <w:spacing w:after="60"/>
+        <w:jc w:val="both"/>
+      </w:pPr>
       <w:r>
         <w:rPr>
           <w:b/>
@@ -366,18 +391,6 @@
       </w:r>
       <w:r>
         <w:t xml:space="preserve"> The effect is shown for a strong model on famous books and not detected on obscure ones; the pipeline leak is a design property with a measured fix. Events are model-selected and no human labels are used.</w:t>
-      </w:r>
-    </w:p>
-    <w:p>
-      <w:pPr>
-        <w:spacing w:after="40"/>
-      </w:pPr>
-      <w:r>
-        <w:rPr>
-          <w:i/>
-          <w:sz w:val="16"/>
-        </w:rPr>
-        <w:t>(246 words)</w:t>
       </w:r>
     </w:p>
     <w:p>
@@ -391,7 +404,7 @@
           <w:color w:val="1F6FB5"/>
           <w:sz w:val="25"/>
         </w:rPr>
-        <w:t>[3]  Introduction</w:t>
+        <w:t>Introduction</w:t>
       </w:r>
     </w:p>
     <w:p>
@@ -469,7 +482,7 @@
         <w:t>Method discipline.</w:t>
       </w:r>
       <w:r>
-        <w:t xml:space="preserve"> The study was run as a sequence of pre-registered versions with hashed manifests. Along the way we found and corrected a statistical error (items inside one event are not independent, so intervals now resample events), added a cue-preserving control because renaming to gibberish also removes name cues, and recorded a failed replication. A final pre-registered confirmatory run with open-weight models on a rented GPU (section 12) tested the effect on mostly obscure books and did not detect it; that null is reported with its limits.</w:t>
+        <w:t xml:space="preserve"> The study was run as a sequence of pre-registered versions with hashed manifests. Along the way we found and corrected a statistical error (items inside one event are not independent, so intervals now resample events), added a cue-preserving control because renaming to gibberish also removes name cues, and recorded a failed replication. A final pre-registered confirmatory run with open-weight models on a rented GPU (see Result Analysis and Discussion) tested the effect on mostly obscure books and did not detect it; that null is reported with its limits.</w:t>
       </w:r>
     </w:p>
     <w:p>
@@ -483,7 +496,7 @@
         <w:t>Results and analysis.</w:t>
       </w:r>
       <w:r>
-        <w:t xml:space="preserve"> For the reference model the leakage gap is +26.0 points over 38 events, and it appears in all three datasets. Four local 7-9B models show +11.5 pooled but zero on the seven least-known books. Restoring name cues repairs plain-control accuracy but does not restore premature naming, which points to name-keyed memory rather than lost cues. The gap rises with how well the book is recognised. The graph audit finds the resolver exactly prefix-causal and one derived stage, personas, looking ahead. Section 12 gives the evidence, and section 7 states what was and was not done by whom.</w:t>
+        <w:t xml:space="preserve"> For the reference model the leakage gap is +26.0 points over 38 events, and it appears in all three datasets. Four local 7-9B models show +11.5 pooled but zero on the seven least-known books. Restoring name cues repairs plain-control accuracy but does not restore premature naming, which points to name-keyed memory rather than lost cues. The gap rises with how well the book is recognised. The graph audit finds the resolver exactly prefix-causal and one derived stage, personas, looking ahead. The Result Analysis and Discussion section gives the evidence, and the Individual Contributions section states what was and was not done by whom.</w:t>
       </w:r>
     </w:p>
     <w:p>
@@ -497,7 +510,7 @@
           <w:color w:val="1F6FB5"/>
           <w:sz w:val="25"/>
         </w:rPr>
-        <w:t>[4]  Background / Related Work</w:t>
+        <w:t>Background / Related Work</w:t>
       </w:r>
     </w:p>
     <w:p>
@@ -3463,7 +3476,7 @@
           <w:color w:val="1F6FB5"/>
           <w:sz w:val="25"/>
         </w:rPr>
-        <w:t>[5]  Summary of Limitations / Gaps</w:t>
+        <w:t>Summary of Limitations / Gaps</w:t>
       </w:r>
     </w:p>
     <w:p>
@@ -3884,7 +3897,7 @@
           <w:color w:val="1F6FB5"/>
           <w:sz w:val="25"/>
         </w:rPr>
-        <w:t>[6]  Primary Contributions of the Project</w:t>
+        <w:t>Primary Contributions of the Project</w:t>
       </w:r>
     </w:p>
     <w:p>
@@ -4018,7 +4031,7 @@
           <w:color w:val="1F6FB5"/>
           <w:sz w:val="25"/>
         </w:rPr>
-        <w:t>[7]  Individual Contributions</w:t>
+        <w:t>Individual Contributions</w:t>
       </w:r>
     </w:p>
     <w:p>
@@ -4213,7 +4226,7 @@
               <w:rPr>
                 <w:sz w:val="17"/>
               </w:rPr>
-              <w:t>Atharva Sheerh Pandey</w:t>
+              <w:t>Atharva Sheersh Pandey</w:t>
             </w:r>
           </w:p>
           <w:p>
@@ -4422,7 +4435,7 @@
           <w:color w:val="1F6FB5"/>
           <w:sz w:val="25"/>
         </w:rPr>
-        <w:t>[8]  Tools and Technologies Used</w:t>
+        <w:t>Tools and Technologies Used</w:t>
       </w:r>
     </w:p>
     <w:p>
@@ -4609,7 +4622,7 @@
               <w:rPr>
                 <w:sz w:val="17"/>
               </w:rPr>
-              <w:t>Confirmatory run on 24-32B open models (cost in section 12)</w:t>
+              <w:t>Confirmatory run on 24-32B open models (cost in the Result Analysis and Discussion section)</w:t>
             </w:r>
           </w:p>
         </w:tc>
@@ -4927,7 +4940,7 @@
               <w:rPr>
                 <w:sz w:val="17"/>
               </w:rPr>
-              <w:t>Research view for the demonstration (section 14)</w:t>
+              <w:t>Research view for the demonstration (see User Manual)</w:t>
             </w:r>
           </w:p>
         </w:tc>
@@ -4949,7 +4962,7 @@
           <w:color w:val="1F6FB5"/>
           <w:sz w:val="25"/>
         </w:rPr>
-        <w:t>[9]  Methodology Used</w:t>
+        <w:t>Methodology Used</w:t>
       </w:r>
     </w:p>
     <w:p>
@@ -5218,7 +5231,7 @@
           <w:color w:val="1F6FB5"/>
           <w:sz w:val="25"/>
         </w:rPr>
-        <w:t>[10]  Dataset Used</w:t>
+        <w:t>Dataset Used</w:t>
       </w:r>
     </w:p>
     <w:p>
@@ -5843,7 +5856,7 @@
           <w:color w:val="1F6FB5"/>
           <w:sz w:val="25"/>
         </w:rPr>
-        <w:t>[11]  Proposed Approach</w:t>
+        <w:t>Proposed Approach</w:t>
       </w:r>
     </w:p>
     <w:p>
@@ -5991,7 +6004,7 @@
           <w:color w:val="1F6FB5"/>
           <w:sz w:val="25"/>
         </w:rPr>
-        <w:t>[12]  Result Analysis and Discussion</w:t>
+        <w:t>Result Analysis and Discussion</w:t>
       </w:r>
     </w:p>
     <w:p>
@@ -6623,7 +6636,7 @@
         <w:t>failed</w:t>
       </w:r>
       <w:r>
-        <w:t xml:space="preserve"> for the small models and held for the reference model. Section 12 therefore supports a narrower claim than 'models leak': the strongest model leaks clearly, and small models leak where they know the book.</w:t>
+        <w:t xml:space="preserve"> for the small models and held for the reference model. The Result Analysis and Discussion section therefore supports a narrower claim than 'models leak': the strongest model leaks clearly, and small models leak where they know the book.</w:t>
       </w:r>
     </w:p>
     <w:p>
@@ -8185,7 +8198,7 @@
               <w:rPr>
                 <w:sz w:val="16"/>
               </w:rPr>
-              <w:t>a few seconds on an 8 GB GPU (measured in the demo, section 14)</w:t>
+              <w:t>a few seconds on an 8 GB GPU (measured in the demo; see the User Manual)</w:t>
             </w:r>
           </w:p>
         </w:tc>
@@ -10872,7 +10885,7 @@
           <w:color w:val="1F6FB5"/>
           <w:sz w:val="25"/>
         </w:rPr>
-        <w:t>[13]  Comparative Analysis</w:t>
+        <w:t>Comparative Analysis</w:t>
       </w:r>
     </w:p>
     <w:p>
@@ -11668,7 +11681,7 @@
           <w:color w:val="1F6FB5"/>
           <w:sz w:val="25"/>
         </w:rPr>
-        <w:t>[14]  User Manual</w:t>
+        <w:t>User Manual</w:t>
       </w:r>
     </w:p>
     <w:p>
@@ -12058,7 +12071,7 @@
           <w:color w:val="1F6FB5"/>
           <w:sz w:val="25"/>
         </w:rPr>
-        <w:t>[15]  References</w:t>
+        <w:t>References</w:t>
       </w:r>
     </w:p>
     <w:p>
@@ -12664,7 +12677,7 @@
           <w:color w:val="1F6FB5"/>
           <w:sz w:val="25"/>
         </w:rPr>
-        <w:t>[16]  Appendix</w:t>
+        <w:t>Appendix</w:t>
       </w:r>
     </w:p>
     <w:p>
@@ -12694,7 +12707,7 @@
         <w:rPr>
           <w:sz w:val="19"/>
         </w:rPr>
-        <w:t xml:space="preserve"> https://drive.google.com/file/d/1GgZj58td5UjoiB-gqE5oECHq3qWrB2aJ/view?usp=sharing</w:t>
+        <w:t xml:space="preserve"> https://drive.google.com/file/d/1GgZj58td5UjoiB-gqE5oECHq3qWrB2aJ/view?usp=drive_link</w:t>
       </w:r>
     </w:p>
     <w:p>
@@ -12709,7 +12722,7 @@
         <w:rPr>
           <w:sz w:val="19"/>
         </w:rPr>
-        <w:t xml:space="preserve"> https://github.com/adhyan-jain/EchoTales/tree/chimera/system-adapters (branch chimera/system-adapters). Steps are in docs/paper/project_doc/RUN_STEPS.md and summarised here:</w:t>
+        <w:t xml:space="preserve"> https://github.com/adhyan-jain/EchoTales. Steps are in docs/paper/project_doc/RUN_STEPS.md and summarised here:</w:t>
       </w:r>
     </w:p>
     <w:p>
@@ -12848,23 +12861,6 @@
           <w:sz w:val="18"/>
         </w:rPr>
         <w:t>Start the interface and open the Research page (FRONTEND_RESEARCH_VIEW.md).</w:t>
-      </w:r>
-    </w:p>
-    <w:p>
-      <w:r>
-        <w:rPr>
-          <w:b/>
-          <w:i/>
-          <w:sz w:val="18"/>
-        </w:rPr>
-        <w:t>Provenance statement.</w:t>
-      </w:r>
-      <w:r>
-        <w:rPr>
-          <w:i/>
-          <w:sz w:val="18"/>
-        </w:rPr>
-        <w:t xml:space="preserve"> All numbers are text-derived, synthetic or system-internal. No human-annotated result is reported. Events were selected by a language model and checked by exact text search and a second language model, not by a person.</w:t>
       </w:r>
     </w:p>
     <w:sectPr>

</xml_diff>